<commit_message>
resume with dezerv short.io
</commit_message>
<xml_diff>
--- a/public/Karan Sanas Product Designer [ATS].docx
+++ b/public/Karan Sanas Product Designer [ATS].docx
@@ -51,21 +51,16 @@
         </w:rPr>
         <w:t xml:space="preserve">Product Designer &amp; Design Engineer with ~7 years of shipping products, systems, &amp; production code.</w:t>
       </w:r>
-      <w:r>
-        <w:rPr>
-          <w:rtl w:val="0"/>
-        </w:rPr>
-      </w:r>
-    </w:p>
-    <w:p>
-      <w:pPr>
-        <w:rPr>
-          <w:rFonts w:ascii="Arial" w:cs="Arial" w:eastAsia="Arial" w:hAnsi="Arial"/>
-          <w:sz w:val="20"/>
-          <w:szCs w:val="20"/>
-        </w:rPr>
-      </w:pPr>
-      <w:hyperlink r:id="rId6">
+    </w:p>
+    <w:p>
+      <w:pPr>
+        <w:rPr>
+          <w:rFonts w:ascii="Arial" w:cs="Arial" w:eastAsia="Arial" w:hAnsi="Arial"/>
+          <w:sz w:val="20"/>
+          <w:szCs w:val="20"/>
+        </w:rPr>
+      </w:pPr>
+      <w:hyperlink r:id="rId7">
         <w:r>
           <w:rPr>
             <w:rFonts w:ascii="Arial" w:cs="Arial" w:eastAsia="Arial" w:hAnsi="Arial"/>
@@ -87,7 +82,7 @@
         </w:rPr>
         <w:t xml:space="preserve"> | </w:t>
       </w:r>
-      <w:hyperlink r:id="rId7">
+      <w:hyperlink r:id="rId8">
         <w:r>
           <w:rPr>
             <w:rFonts w:ascii="Arial" w:cs="Arial" w:eastAsia="Arial" w:hAnsi="Arial"/>
@@ -109,7 +104,7 @@
         </w:rPr>
         <w:t xml:space="preserve"> | </w:t>
       </w:r>
-      <w:hyperlink r:id="rId8">
+      <w:hyperlink r:id="rId9">
         <w:r>
           <w:rPr>
             <w:rFonts w:ascii="Arial" w:cs="Arial" w:eastAsia="Arial" w:hAnsi="Arial"/>
@@ -206,18 +201,7 @@
           <w:szCs w:val="20"/>
           <w:rtl w:val="0"/>
         </w:rPr>
-        <w:t xml:space="preserve">Product Design &amp; Engineering</w:t>
-      </w:r>
-      <w:r>
-        <w:rPr>
-          <w:rFonts w:ascii="Arial" w:cs="Arial" w:eastAsia="Arial" w:hAnsi="Arial"/>
-          <w:i w:val="1"/>
-          <w:iCs w:val="1"/>
-          <w:sz w:val="20"/>
-          <w:szCs w:val="20"/>
-          <w:rtl w:val="0"/>
-        </w:rPr>
-        <w:t xml:space="preserve"> | Jan 2026 – Present</w:t>
+        <w:t xml:space="preserve">Product Design &amp; Engineering | Jan 2026 – Present</w:t>
       </w:r>
     </w:p>
     <w:p>
@@ -242,7 +226,7 @@
         </w:rPr>
         <w:t xml:space="preserve">Built and launched </w:t>
       </w:r>
-      <w:hyperlink r:id="rId9">
+      <w:hyperlink r:id="rId10">
         <w:r>
           <w:rPr>
             <w:rFonts w:ascii="Arial" w:cs="Arial" w:eastAsia="Arial" w:hAnsi="Arial"/>
@@ -287,11 +271,6 @@
         </w:rPr>
         <w:t xml:space="preserve">Owned product strategy, UX, frontend engineering, backend engineering, deployment, &amp; product marketing.</w:t>
       </w:r>
-      <w:r>
-        <w:rPr>
-          <w:rtl w:val="0"/>
-        </w:rPr>
-      </w:r>
     </w:p>
     <w:p>
       <w:pPr>
@@ -373,7 +352,29 @@
           <w:szCs w:val="20"/>
           <w:rtl w:val="0"/>
         </w:rPr>
-        <w:t xml:space="preserve">Led end-to-end design of Dezerv Web, translating the mobile-first product into the org’s first desktop web experience for investors.</w:t>
+        <w:t xml:space="preserve">Led end-to-end design of </w:t>
+      </w:r>
+      <w:hyperlink r:id="rId11">
+        <w:r>
+          <w:rPr>
+            <w:rFonts w:ascii="Arial" w:cs="Arial" w:eastAsia="Arial" w:hAnsi="Arial"/>
+            <w:color w:val="1155cc"/>
+            <w:sz w:val="20"/>
+            <w:szCs w:val="20"/>
+            <w:u w:val="single"/>
+            <w:rtl w:val="0"/>
+          </w:rPr>
+          <w:t xml:space="preserve">Dezerv Web</w:t>
+        </w:r>
+      </w:hyperlink>
+      <w:r>
+        <w:rPr>
+          <w:rFonts w:ascii="Arial" w:cs="Arial" w:eastAsia="Arial" w:hAnsi="Arial"/>
+          <w:sz w:val="20"/>
+          <w:szCs w:val="20"/>
+          <w:rtl w:val="0"/>
+        </w:rPr>
+        <w:t xml:space="preserve">, translating the mobile-first product into the org’s first desktop web experience for investors.</w:t>
       </w:r>
     </w:p>
     <w:p>
@@ -396,12 +397,29 @@
           <w:szCs w:val="20"/>
           <w:rtl w:val="0"/>
         </w:rPr>
-        <w:t xml:space="preserve">Introduced Prosper, a design system that unifies design foundations across 3 investor products and 1 internal tool, creating a scalable foundation for future products.</w:t>
-      </w:r>
-      <w:r>
-        <w:rPr>
-          <w:rtl w:val="0"/>
-        </w:rPr>
+        <w:t xml:space="preserve">Introduced </w:t>
+      </w:r>
+      <w:hyperlink r:id="rId12">
+        <w:r>
+          <w:rPr>
+            <w:rFonts w:ascii="Arial" w:cs="Arial" w:eastAsia="Arial" w:hAnsi="Arial"/>
+            <w:color w:val="1155cc"/>
+            <w:sz w:val="20"/>
+            <w:szCs w:val="20"/>
+            <w:u w:val="single"/>
+            <w:rtl w:val="0"/>
+          </w:rPr>
+          <w:t xml:space="preserve">Prosper</w:t>
+        </w:r>
+      </w:hyperlink>
+      <w:r>
+        <w:rPr>
+          <w:rFonts w:ascii="Arial" w:cs="Arial" w:eastAsia="Arial" w:hAnsi="Arial"/>
+          <w:sz w:val="20"/>
+          <w:szCs w:val="20"/>
+          <w:rtl w:val="0"/>
+        </w:rPr>
+        <w:t xml:space="preserve">, a design system that unifies design foundations across 3 investor products and 1 internal tool, creating a scalable foundation for future products.</w:t>
       </w:r>
     </w:p>
     <w:p>
@@ -486,11 +504,6 @@
         </w:rPr>
         <w:t xml:space="preserve">Worked on employee onboarding and invoicing experiences for full-time employees, contractors, and freelancers.</w:t>
       </w:r>
-      <w:r>
-        <w:rPr>
-          <w:rtl w:val="0"/>
-        </w:rPr>
-      </w:r>
     </w:p>
     <w:p>
       <w:pPr>
@@ -574,11 +587,6 @@
         </w:rPr>
         <w:t xml:space="preserve">Sold most of my belongings and backpacked across 5+ countries, taking time away from full-time work.</w:t>
       </w:r>
-      <w:r>
-        <w:rPr>
-          <w:rtl w:val="0"/>
-        </w:rPr>
-      </w:r>
     </w:p>
     <w:p>
       <w:pPr>
@@ -662,7 +670,7 @@
         </w:rPr>
         <w:t xml:space="preserve">Contributed across core product, monetization, and growth. As the 2nd designer and 16th employee helped grow the team and establish its </w:t>
       </w:r>
-      <w:hyperlink r:id="rId10">
+      <w:hyperlink r:id="rId13">
         <w:r>
           <w:rPr>
             <w:rFonts w:ascii="Arial" w:cs="Arial" w:eastAsia="Arial" w:hAnsi="Arial"/>
@@ -707,7 +715,7 @@
         </w:rPr>
         <w:t xml:space="preserve">Designed 9 new </w:t>
       </w:r>
-      <w:hyperlink r:id="rId11">
+      <w:hyperlink r:id="rId14">
         <w:r>
           <w:rPr>
             <w:rFonts w:ascii="Arial" w:cs="Arial" w:eastAsia="Arial" w:hAnsi="Arial"/>
@@ -752,7 +760,7 @@
         </w:rPr>
         <w:t xml:space="preserve">Built and evolved </w:t>
       </w:r>
-      <w:hyperlink r:id="rId12">
+      <w:hyperlink r:id="rId15">
         <w:r>
           <w:rPr>
             <w:rFonts w:ascii="Arial" w:cs="Arial" w:eastAsia="Arial" w:hAnsi="Arial"/>
@@ -774,11 +782,6 @@
         </w:rPr>
         <w:t xml:space="preserve">, Quizizz’s design system in Figma, supporting 16 designers and 50+ engineers.</w:t>
       </w:r>
-      <w:r>
-        <w:rPr>
-          <w:rtl w:val="0"/>
-        </w:rPr>
-      </w:r>
     </w:p>
     <w:p>
       <w:pPr>
@@ -840,11 +843,6 @@
         </w:rPr>
         <w:t xml:space="preserve">Launched Quizizz Super, a new paid subscription tier, introducing new features and modes of instruction that generated $1M in revenue in &lt;2 months.</w:t>
       </w:r>
-      <w:r>
-        <w:rPr>
-          <w:rtl w:val="0"/>
-        </w:rPr>
-      </w:r>
     </w:p>
     <w:p>
       <w:pPr>
@@ -970,15 +968,28 @@
         </w:rPr>
         <w:t xml:space="preserve">Design Systems</w:t>
       </w:r>
-      <w:r>
-        <w:rPr>
-          <w:rFonts w:ascii="Arial Unicode MS" w:cs="Arial Unicode MS" w:eastAsia="Arial Unicode MS" w:hAnsi="Arial Unicode MS"/>
-          <w:sz w:val="20"/>
-          <w:szCs w:val="20"/>
-          <w:rtl w:val="0"/>
-        </w:rPr>
-        <w:tab/>
-        <w:t xml:space="preserve">Design Tokens, Component Libraries, Design ↔ Code Parity, Documentation</w:t>
+      <w:sdt>
+        <w:sdtPr>
+          <w:id w:val="169081629"/>
+          <w:tag w:val="goog_rdk_0"/>
+        </w:sdtPr>
+        <w:sdtContent>
+          <w:r>
+            <w:rPr>
+              <w:rFonts w:ascii="Arial Unicode MS" w:cs="Arial Unicode MS" w:eastAsia="Arial Unicode MS" w:hAnsi="Arial Unicode MS"/>
+              <w:sz w:val="20"/>
+              <w:szCs w:val="20"/>
+              <w:rtl w:val="0"/>
+            </w:rPr>
+            <w:tab/>
+            <w:t xml:space="preserve">Design Tokens, Component Libraries, Design ↔ Code Parity, Documentation</w:t>
+          </w:r>
+        </w:sdtContent>
+      </w:sdt>
+      <w:r>
+        <w:rPr>
+          <w:rtl w:val="0"/>
+        </w:rPr>
       </w:r>
     </w:p>
     <w:p>
@@ -1095,90 +1106,68 @@
           <w:szCs w:val="20"/>
           <w:rtl w:val="0"/>
         </w:rPr>
-        <w:t xml:space="preserve">St. Xavier’s College, Mumbai</w:t>
-      </w:r>
-      <w:r>
+        <w:t xml:space="preserve">St. Xavier’s College, Mumbai, 2017</w:t>
+      </w:r>
+    </w:p>
+    <w:p>
+      <w:pPr>
+        <w:spacing w:line="240" w:lineRule="auto"/>
+        <w:rPr>
+          <w:rFonts w:ascii="Arial" w:cs="Arial" w:eastAsia="Arial" w:hAnsi="Arial"/>
+          <w:sz w:val="20"/>
+          <w:szCs w:val="20"/>
+        </w:rPr>
+      </w:pPr>
+      <w:r>
+        <w:rPr>
+          <w:rtl w:val="0"/>
+        </w:rPr>
+      </w:r>
+    </w:p>
+    <w:p>
+      <w:pPr>
+        <w:spacing w:line="240" w:lineRule="auto"/>
+        <w:rPr>
+          <w:rFonts w:ascii="Arial" w:cs="Arial" w:eastAsia="Arial" w:hAnsi="Arial"/>
+          <w:b w:val="1"/>
+          <w:bCs w:val="1"/>
+          <w:sz w:val="20"/>
+          <w:szCs w:val="20"/>
+        </w:rPr>
+      </w:pPr>
+      <w:r>
+        <w:rPr>
+          <w:rFonts w:ascii="Arial" w:cs="Arial" w:eastAsia="Arial" w:hAnsi="Arial"/>
+          <w:b w:val="1"/>
+          <w:bCs w:val="1"/>
+          <w:sz w:val="20"/>
+          <w:szCs w:val="20"/>
+          <w:rtl w:val="0"/>
+        </w:rPr>
+        <w:t xml:space="preserve">MicroMasters, UX Research and Design (via edX)</w:t>
+      </w:r>
+    </w:p>
+    <w:p>
+      <w:pPr>
+        <w:spacing w:line="240" w:lineRule="auto"/>
         <w:rPr>
           <w:rFonts w:ascii="Arial" w:cs="Arial" w:eastAsia="Arial" w:hAnsi="Arial"/>
           <w:i w:val="1"/>
           <w:iCs w:val="1"/>
           <w:sz w:val="20"/>
           <w:szCs w:val="20"/>
-          <w:rtl w:val="0"/>
-        </w:rPr>
-        <w:t xml:space="preserve">, 2017</w:t>
-      </w:r>
-    </w:p>
-    <w:p>
-      <w:pPr>
-        <w:spacing w:line="240" w:lineRule="auto"/>
-        <w:rPr>
-          <w:rFonts w:ascii="Arial" w:cs="Arial" w:eastAsia="Arial" w:hAnsi="Arial"/>
-          <w:sz w:val="20"/>
-          <w:szCs w:val="20"/>
-        </w:rPr>
-      </w:pPr>
-      <w:r>
-        <w:rPr>
-          <w:rtl w:val="0"/>
-        </w:rPr>
-      </w:r>
-    </w:p>
-    <w:p>
-      <w:pPr>
-        <w:spacing w:line="240" w:lineRule="auto"/>
-        <w:rPr>
-          <w:rFonts w:ascii="Arial" w:cs="Arial" w:eastAsia="Arial" w:hAnsi="Arial"/>
-          <w:b w:val="1"/>
-          <w:bCs w:val="1"/>
-          <w:sz w:val="20"/>
-          <w:szCs w:val="20"/>
-        </w:rPr>
-      </w:pPr>
-      <w:r>
-        <w:rPr>
-          <w:rFonts w:ascii="Arial" w:cs="Arial" w:eastAsia="Arial" w:hAnsi="Arial"/>
-          <w:b w:val="1"/>
-          <w:bCs w:val="1"/>
-          <w:sz w:val="20"/>
-          <w:szCs w:val="20"/>
-          <w:rtl w:val="0"/>
-        </w:rPr>
-        <w:t xml:space="preserve">MicroMasters, UX Research and Design (via edX)</w:t>
-      </w:r>
-    </w:p>
-    <w:p>
-      <w:pPr>
-        <w:spacing w:line="240" w:lineRule="auto"/>
+        </w:rPr>
+      </w:pPr>
+      <w:r>
         <w:rPr>
           <w:rFonts w:ascii="Arial" w:cs="Arial" w:eastAsia="Arial" w:hAnsi="Arial"/>
           <w:i w:val="1"/>
           <w:iCs w:val="1"/>
           <w:sz w:val="20"/>
           <w:szCs w:val="20"/>
-        </w:rPr>
-      </w:pPr>
-      <w:r>
-        <w:rPr>
-          <w:rFonts w:ascii="Arial" w:cs="Arial" w:eastAsia="Arial" w:hAnsi="Arial"/>
-          <w:i w:val="1"/>
-          <w:iCs w:val="1"/>
-          <w:sz w:val="20"/>
-          <w:szCs w:val="20"/>
-          <w:rtl w:val="0"/>
-        </w:rPr>
-        <w:t xml:space="preserve">The University of Michigan, Ann Arbor</w:t>
-      </w:r>
-      <w:r>
-        <w:rPr>
-          <w:rFonts w:ascii="Arial" w:cs="Arial" w:eastAsia="Arial" w:hAnsi="Arial"/>
-          <w:i w:val="1"/>
-          <w:iCs w:val="1"/>
-          <w:sz w:val="20"/>
-          <w:szCs w:val="20"/>
-          <w:rtl w:val="0"/>
-        </w:rPr>
-        <w:t xml:space="preserve">, 2019</w:t>
+          <w:rtl w:val="0"/>
+        </w:rPr>
+        <w:t xml:space="preserve">The University of Michigan, Ann Arbor, 2019</w:t>
       </w:r>
     </w:p>
     <w:sectPr>
@@ -2351,4 +2340,19 @@
   </a:objectDefaults>
   <a:extraClrSchemeLst/>
 </a:theme>
+</file>
+
+<file path=customXML/item1.xml><?xml version="1.0" encoding="utf-8"?>
+<go:gDocsCustomXmlDataStorage xmlns:go="http://customooxmlschemas.google.com/" xmlns:r="http://schemas.openxmlformats.org/officeDocument/2006/relationships" uri="GoogleDocsCustomDataVersion2">
+  <go:docsCustomData xmlns:go="http://customooxmlschemas.google.com/" roundtripDataSignature="AMtx7miSMb4uGuqEI8g36GKczUlzQANwZg==">CgMxLjAaJAoBMBIfCh0IB0IZCgVBcmltbxIQQXJpYWwgVW5pY29kZSBNUzgAciExTmdDNDhwSjFfMkJsaUcwZ3l4NlVtOVRDN09PbmZtUE0=</go:docsCustomData>
+</go:gDocsCustomXmlDataStorage>
+</file>
+
+<file path=customXML/itemProps1.xml><?xml version="1.0" encoding="utf-8"?>
+<ds:datastoreItem xmlns:ds="http://schemas.openxmlformats.org/officeDocument/2006/customXml" ds:itemID="{11111111-1234-1234-1234-123412341234}">
+  <ds:schemaRefs>
+    <ds:schemaRef ds:uri="http://schemas.openxmlformats.org/officeDocument/2006/relationships"/>
+    <ds:schemaRef ds:uri="http://customooxmlschemas.google.com/"/>
+  </ds:schemaRefs>
+</ds:datastoreItem>
 </file>
</xml_diff>